<commit_message>
Update: added changes by 2nd
</commit_message>
<xml_diff>
--- a/8В41_Корнев_ТХИ_ЛБ1.docx
+++ b/8В41_Корнев_ТХИ_ЛБ1.docx
@@ -624,6 +624,16 @@
       </w:pPr>
       <w:r>
         <w:t> По данным обследований населения по проблемам занятости, 57% занятого населения имеют высшее или среднее профессиональное образование (30% - высшее и 27% - среднее профессиональное). C 2000г. доля занятого населения с высшим профессиональным образованием увеличилась (на 4 процентных пункта), со средним профессиональным - сократилась (на 4 процентных пункта).</w:t>
+      </w:r>
+      <w:r>
+        <w:t xml:space="preserve"> </w:t>
+      </w:r>
+      <w:r>
+        <w:rPr>
+          <w:b/>
+          <w:bCs/>
+        </w:rPr>
+        <w:t>ВНЕСЕНЫ ИЗМЕНЕНИЯ УЧАСТНИКОМ 2</w:t>
       </w:r>
     </w:p>
     <w:p>

</xml_diff>